<commit_message>
fix: A delay has been added to the model. New parameter values ​​defined
</commit_message>
<xml_diff>
--- a/2024/Modeling fix/Fix modeling.docx
+++ b/2024/Modeling fix/Fix modeling.docx
@@ -89,10 +89,10 @@
             <v:path o:extrusionok="f" gradientshapeok="t" o:connecttype="rect"/>
             <o:lock v:ext="edit" aspectratio="t"/>
           </v:shapetype>
-          <v:shape id="_x0000_i1027" type="#_x0000_t75" style="width:231.8pt;height:125.85pt" o:ole="">
+          <v:shape id="_x0000_i1025" type="#_x0000_t75" style="width:231.6pt;height:125.75pt" o:ole="">
             <v:imagedata r:id="rId5" o:title=""/>
           </v:shape>
-          <o:OLEObject Type="Embed" ProgID="Equation.DSMT4" ShapeID="_x0000_i1027" DrawAspect="Content" ObjectID="_1775139166" r:id="rId6"/>
+          <o:OLEObject Type="Embed" ProgID="Equation.DSMT4" ShapeID="_x0000_i1025" DrawAspect="Content" ObjectID="_1775316964" r:id="rId6"/>
         </w:object>
       </w:r>
     </w:p>
@@ -127,10 +127,10 @@
           <w:position w:val="-132"/>
         </w:rPr>
         <w:object w:dxaOrig="6000" w:dyaOrig="2620" w14:anchorId="64338217">
-          <v:shape id="_x0000_i1032" type="#_x0000_t75" style="width:300.3pt;height:131.1pt" o:ole="">
+          <v:shape id="_x0000_i1026" type="#_x0000_t75" style="width:300.35pt;height:131.1pt" o:ole="">
             <v:imagedata r:id="rId7" o:title=""/>
           </v:shape>
-          <o:OLEObject Type="Embed" ProgID="Equation.DSMT4" ShapeID="_x0000_i1032" DrawAspect="Content" ObjectID="_1775139167" r:id="rId8"/>
+          <o:OLEObject Type="Embed" ProgID="Equation.DSMT4" ShapeID="_x0000_i1026" DrawAspect="Content" ObjectID="_1775316965" r:id="rId8"/>
         </w:object>
       </w:r>
     </w:p>
@@ -159,7 +159,6 @@
         </w:rPr>
         <w:t>_</w:t>
       </w:r>
-      <w:proofErr w:type="gramStart"/>
       <w:r>
         <w:rPr>
           <w:lang w:val="en-US" w:eastAsia="ja-JP"/>
@@ -172,7 +171,6 @@
         </w:rPr>
         <w:t xml:space="preserve"> &gt;</w:t>
       </w:r>
-      <w:proofErr w:type="gramEnd"/>
       <w:r>
         <w:rPr>
           <w:lang w:eastAsia="ja-JP"/>
@@ -189,9 +187,6 @@
     <w:p>
       <w:pPr>
         <w:pStyle w:val="MTDisplayEquation"/>
-        <w:rPr>
-          <w:rFonts w:hint="eastAsia"/>
-        </w:rPr>
       </w:pPr>
       <w:r>
         <w:tab/>
@@ -201,10 +196,10 @@
           <w:position w:val="-132"/>
         </w:rPr>
         <w:object w:dxaOrig="5340" w:dyaOrig="2620" w14:anchorId="289825DF">
-          <v:shape id="_x0000_i1036" type="#_x0000_t75" style="width:266.95pt;height:131.1pt" o:ole="">
+          <v:shape id="_x0000_i1027" type="#_x0000_t75" style="width:267.05pt;height:131.1pt" o:ole="">
             <v:imagedata r:id="rId9" o:title=""/>
           </v:shape>
-          <o:OLEObject Type="Embed" ProgID="Equation.DSMT4" ShapeID="_x0000_i1036" DrawAspect="Content" ObjectID="_1775139168" r:id="rId10"/>
+          <o:OLEObject Type="Embed" ProgID="Equation.DSMT4" ShapeID="_x0000_i1027" DrawAspect="Content" ObjectID="_1775316966" r:id="rId10"/>
         </w:object>
       </w:r>
     </w:p>
@@ -259,15 +254,7 @@
         <w:t>v</w:t>
       </w:r>
       <w:r>
-        <w:t xml:space="preserve">, при этом разряд в момент начала дополнительного </w:t>
-      </w:r>
-      <w:proofErr w:type="spellStart"/>
-      <w:r>
-        <w:t>газонапуска</w:t>
-      </w:r>
-      <w:proofErr w:type="spellEnd"/>
-      <w:r>
-        <w:t xml:space="preserve">. Значения параметров при заданных </w:t>
+        <w:t xml:space="preserve">, при этом разряд в момент начала дополнительного газонапуска. Значения параметров при заданных </w:t>
       </w:r>
       <w:r>
         <w:rPr>
@@ -348,7 +335,6 @@
           <w:lang w:val="en-US"/>
         </w:rPr>
       </w:pPr>
-      <w:proofErr w:type="spellStart"/>
       <w:r>
         <w:rPr>
           <w:lang w:val="en-US"/>
@@ -367,7 +353,6 @@
         </w:rPr>
         <w:t>p</w:t>
       </w:r>
-      <w:proofErr w:type="spellEnd"/>
       <w:r>
         <w:rPr>
           <w:lang w:val="en-US"/>
@@ -381,20 +366,12 @@
           <w:lang w:val="en-US"/>
         </w:rPr>
       </w:pPr>
-      <w:proofErr w:type="spellStart"/>
       <w:r>
         <w:rPr>
           <w:lang w:val="en-US"/>
         </w:rPr>
         <w:lastRenderedPageBreak/>
-        <w:t>t_pump</w:t>
-      </w:r>
-      <w:proofErr w:type="spellEnd"/>
-      <w:r>
-        <w:rPr>
-          <w:lang w:val="en-US"/>
-        </w:rPr>
-        <w:t xml:space="preserve"> = 1.776</w:t>
+        <w:t>t_pump = 1.776</w:t>
       </w:r>
     </w:p>
     <w:p>
@@ -420,74 +397,34 @@
         <w:rPr>
           <w:lang w:val="en-US"/>
         </w:rPr>
-        <w:t xml:space="preserve">N_p0 = </w:t>
-      </w:r>
-      <w:proofErr w:type="gramStart"/>
-      <w:r>
-        <w:rPr>
-          <w:lang w:val="en-US"/>
-        </w:rPr>
-        <w:t>0;</w:t>
-      </w:r>
-      <w:proofErr w:type="gramEnd"/>
-    </w:p>
-    <w:p>
-      <w:pPr>
-        <w:rPr>
-          <w:lang w:val="en-US"/>
-        </w:rPr>
-      </w:pPr>
-      <w:proofErr w:type="spellStart"/>
-      <w:r>
-        <w:rPr>
-          <w:lang w:val="en-US"/>
-        </w:rPr>
-        <w:t>t_retention</w:t>
-      </w:r>
-      <w:proofErr w:type="spellEnd"/>
-      <w:r>
-        <w:rPr>
-          <w:lang w:val="en-US"/>
-        </w:rPr>
-        <w:t xml:space="preserve"> = </w:t>
-      </w:r>
-      <w:proofErr w:type="gramStart"/>
-      <w:r>
-        <w:rPr>
-          <w:lang w:val="en-US"/>
-        </w:rPr>
-        <w:t>0.0177;</w:t>
-      </w:r>
-      <w:proofErr w:type="gramEnd"/>
-    </w:p>
-    <w:p>
-      <w:pPr>
-        <w:rPr>
-          <w:lang w:val="en-US"/>
-        </w:rPr>
-      </w:pPr>
-      <w:proofErr w:type="spellStart"/>
-      <w:r>
-        <w:rPr>
-          <w:lang w:val="en-US"/>
-        </w:rPr>
-        <w:t>t_release</w:t>
-      </w:r>
-      <w:proofErr w:type="spellEnd"/>
-      <w:r>
-        <w:rPr>
-          <w:lang w:val="en-US"/>
-        </w:rPr>
-        <w:t xml:space="preserve"> = </w:t>
-      </w:r>
-      <w:proofErr w:type="gramStart"/>
-      <w:r>
-        <w:rPr>
-          <w:lang w:val="en-US"/>
-        </w:rPr>
-        <w:t>0.6889;</w:t>
-      </w:r>
-      <w:proofErr w:type="gramEnd"/>
+        <w:t>N_p0 = 0;</w:t>
+      </w:r>
+    </w:p>
+    <w:p>
+      <w:pPr>
+        <w:rPr>
+          <w:lang w:val="en-US"/>
+        </w:rPr>
+      </w:pPr>
+      <w:r>
+        <w:rPr>
+          <w:lang w:val="en-US"/>
+        </w:rPr>
+        <w:t>t_retention = 0.0177;</w:t>
+      </w:r>
+    </w:p>
+    <w:p>
+      <w:pPr>
+        <w:rPr>
+          <w:lang w:val="en-US"/>
+        </w:rPr>
+      </w:pPr>
+      <w:r>
+        <w:rPr>
+          <w:lang w:val="en-US"/>
+        </w:rPr>
+        <w:t>t_release = 0.6889;</w:t>
+      </w:r>
     </w:p>
     <w:p>
       <w:r>
@@ -506,13 +443,8 @@
         <w:t>ion</w:t>
       </w:r>
       <w:r>
-        <w:t xml:space="preserve"> = </w:t>
-      </w:r>
-      <w:proofErr w:type="gramStart"/>
-      <w:r>
-        <w:t>0.0338;</w:t>
-      </w:r>
-      <w:proofErr w:type="gramEnd"/>
+        <w:t xml:space="preserve"> = 0.0338;</w:t>
+      </w:r>
     </w:p>
     <w:p>
       <w:r>
@@ -531,11 +463,7 @@
         <w:t>w</w:t>
       </w:r>
       <w:r>
-        <w:t>0 = 1.</w:t>
-      </w:r>
-      <w:proofErr w:type="gramStart"/>
-      <w:r>
-        <w:t>0469</w:t>
+        <w:t>0 = 1.0469</w:t>
       </w:r>
       <w:r>
         <w:rPr>
@@ -546,7 +474,6 @@
       <w:r>
         <w:t>20;</w:t>
       </w:r>
-      <w:proofErr w:type="gramEnd"/>
     </w:p>
     <w:p>
       <w:pPr>
@@ -562,6 +489,7 @@
       </w:pPr>
       <w:r>
         <w:rPr>
+          <w:noProof/>
           <w:lang w:eastAsia="ja-JP"/>
         </w:rPr>
         <w:drawing>
@@ -693,6 +621,7 @@
       </w:pPr>
       <w:r>
         <w:rPr>
+          <w:noProof/>
           <w:lang w:eastAsia="ja-JP"/>
         </w:rPr>
         <w:lastRenderedPageBreak/>
@@ -756,21 +685,8 @@
         <w:t xml:space="preserve"> - </w:t>
       </w:r>
       <w:r>
-        <w:t xml:space="preserve">Работа модели в диапазоне </w:t>
-      </w:r>
-      <w:proofErr w:type="gramStart"/>
-      <w:r>
-        <w:t>0-50</w:t>
-      </w:r>
-      <w:proofErr w:type="gramEnd"/>
-      <w:r>
-        <w:t xml:space="preserve"> с. Начало разряда 27.1 с, конец разряда 28 с, прекращение </w:t>
-      </w:r>
-      <w:proofErr w:type="spellStart"/>
-      <w:r>
-        <w:t>газонапуска</w:t>
-      </w:r>
-      <w:proofErr w:type="spellEnd"/>
+        <w:t>Работа модели в диапазоне 0-50 с. Начало разряда 27.1 с, конец разряда 28 с, прекращение газонапуска</w:t>
+      </w:r>
       <w:r>
         <w:rPr>
           <w:noProof/>
@@ -785,6 +701,7 @@
       </w:pPr>
       <w:r>
         <w:rPr>
+          <w:noProof/>
           <w:lang w:eastAsia="ja-JP"/>
         </w:rPr>
         <w:lastRenderedPageBreak/>
@@ -829,9 +746,6 @@
       <w:pPr>
         <w:ind w:firstLine="0"/>
         <w:jc w:val="center"/>
-        <w:rPr>
-          <w:lang w:eastAsia="ja-JP"/>
-        </w:rPr>
       </w:pPr>
       <w:r>
         <w:t xml:space="preserve">Рисунок </w:t>
@@ -845,19 +759,835 @@
         </w:r>
       </w:fldSimple>
       <w:r>
-        <w:t xml:space="preserve">  - </w:t>
-      </w:r>
-      <w:r>
-        <w:t xml:space="preserve">Работа модели в диапазоне </w:t>
-      </w:r>
-      <w:proofErr w:type="gramStart"/>
-      <w:r>
-        <w:t>0-50</w:t>
-      </w:r>
-      <w:proofErr w:type="gramEnd"/>
-      <w:r>
-        <w:t xml:space="preserve"> с</w:t>
-      </w:r>
+        <w:t xml:space="preserve">  - Работа модели в диапазоне 0-50 с</w:t>
+      </w:r>
+    </w:p>
+    <w:p>
+      <w:pPr>
+        <w:ind w:firstLine="0"/>
+        <w:jc w:val="center"/>
+        <w:rPr>
+          <w:lang w:eastAsia="ja-JP"/>
+        </w:rPr>
+        <w:sectPr>
+          <w:pgSz w:w="16838" w:h="11906" w:orient="landscape"/>
+          <w:pgMar w:top="1701" w:right="1134" w:bottom="850" w:left="1134" w:header="708" w:footer="708" w:gutter="0"/>
+          <w:cols w:space="708"/>
+          <w:docGrid w:linePitch="381"/>
+        </w:sectPr>
+      </w:pPr>
+    </w:p>
+    <w:p>
+      <w:pPr>
+        <w:rPr>
+          <w:lang w:eastAsia="ja-JP"/>
+        </w:rPr>
+      </w:pPr>
+      <w:r>
+        <w:rPr>
+          <w:lang w:eastAsia="ja-JP"/>
+        </w:rPr>
+        <w:lastRenderedPageBreak/>
+        <w:t>Как видно из графиков на рисунке 1, необходимо</w:t>
+      </w:r>
+      <w:r>
+        <w:rPr>
+          <w:lang w:eastAsia="ja-JP"/>
+        </w:rPr>
+        <w:t xml:space="preserve"> добавить запаздывание на передний фронт</w:t>
+      </w:r>
+      <w:r>
+        <w:rPr>
+          <w:lang w:eastAsia="ja-JP"/>
+        </w:rPr>
+        <w:t>, величина запаздывания, исходя из графиков, составляет приблизительно</w:t>
+      </w:r>
+      <w:r>
+        <w:rPr>
+          <w:lang w:eastAsia="ja-JP"/>
+        </w:rPr>
+        <w:t xml:space="preserve"> 0</w:t>
+      </w:r>
+      <w:r>
+        <w:rPr>
+          <w:lang w:eastAsia="ja-JP"/>
+        </w:rPr>
+        <w:t>,</w:t>
+      </w:r>
+      <w:r>
+        <w:rPr>
+          <w:lang w:eastAsia="ja-JP"/>
+        </w:rPr>
+        <w:t>12</w:t>
+      </w:r>
+      <w:r>
+        <w:rPr>
+          <w:lang w:eastAsia="ja-JP"/>
+        </w:rPr>
+        <w:t xml:space="preserve"> </w:t>
+      </w:r>
+      <w:r>
+        <w:rPr>
+          <w:lang w:eastAsia="ja-JP"/>
+        </w:rPr>
+        <w:t>с.</w:t>
+      </w:r>
+    </w:p>
+    <w:p>
+      <w:pPr>
+        <w:rPr>
+          <w:lang w:eastAsia="ja-JP"/>
+        </w:rPr>
+      </w:pPr>
+      <w:r>
+        <w:rPr>
+          <w:lang w:eastAsia="ja-JP"/>
+        </w:rPr>
+        <w:t>С учетом вышесказанного были определены новые значения параметров</w:t>
+      </w:r>
+      <w:r>
+        <w:rPr>
+          <w:lang w:eastAsia="ja-JP"/>
+        </w:rPr>
+        <w:t>:</w:t>
+      </w:r>
+    </w:p>
+    <w:p>
+      <w:r>
+        <w:rPr>
+          <w:lang w:val="en-US"/>
+        </w:rPr>
+        <w:t>t</w:t>
+      </w:r>
+      <w:r>
+        <w:t>_</w:t>
+      </w:r>
+      <w:r>
+        <w:rPr>
+          <w:lang w:val="en-US"/>
+        </w:rPr>
+        <w:t>p</w:t>
+      </w:r>
+      <w:r>
+        <w:t xml:space="preserve"> = 0.037</w:t>
+      </w:r>
+    </w:p>
+    <w:p>
+      <w:pPr>
+        <w:rPr>
+          <w:lang w:val="en-US"/>
+        </w:rPr>
+      </w:pPr>
+      <w:r>
+        <w:rPr>
+          <w:lang w:val="en-US"/>
+        </w:rPr>
+        <w:t>t_pump = 1.776</w:t>
+      </w:r>
+    </w:p>
+    <w:p>
+      <w:pPr>
+        <w:rPr>
+          <w:lang w:val="en-US"/>
+        </w:rPr>
+      </w:pPr>
+      <w:r>
+        <w:rPr>
+          <w:lang w:val="en-US"/>
+        </w:rPr>
+        <w:t>N_v0 = 5.</w:t>
+      </w:r>
+      <w:r>
+        <w:rPr>
+          <w:lang w:val="en-US"/>
+        </w:rPr>
+        <w:t>7</w:t>
+      </w:r>
+      <w:r>
+        <w:rPr>
+          <w:lang w:val="en-US"/>
+        </w:rPr>
+        <w:t>e+18</w:t>
+      </w:r>
+    </w:p>
+    <w:p>
+      <w:pPr>
+        <w:rPr>
+          <w:lang w:val="en-US"/>
+        </w:rPr>
+      </w:pPr>
+      <w:r>
+        <w:rPr>
+          <w:lang w:val="en-US"/>
+        </w:rPr>
+        <w:t>N_p0 = 0;</w:t>
+      </w:r>
+    </w:p>
+    <w:p>
+      <w:pPr>
+        <w:rPr>
+          <w:lang w:val="en-US"/>
+        </w:rPr>
+      </w:pPr>
+      <w:r>
+        <w:rPr>
+          <w:lang w:val="en-US"/>
+        </w:rPr>
+        <w:t>t_retention = 0.01</w:t>
+      </w:r>
+      <w:r>
+        <w:rPr>
+          <w:lang w:val="en-US"/>
+        </w:rPr>
+        <w:t>05</w:t>
+      </w:r>
+      <w:r>
+        <w:rPr>
+          <w:lang w:val="en-US"/>
+        </w:rPr>
+        <w:t>;</w:t>
+      </w:r>
+    </w:p>
+    <w:p>
+      <w:pPr>
+        <w:rPr>
+          <w:lang w:val="en-US"/>
+        </w:rPr>
+      </w:pPr>
+      <w:r>
+        <w:rPr>
+          <w:lang w:val="en-US"/>
+        </w:rPr>
+        <w:t xml:space="preserve">t_release = </w:t>
+      </w:r>
+      <w:r>
+        <w:rPr>
+          <w:lang w:val="en-US"/>
+        </w:rPr>
+        <w:t>45.1398</w:t>
+      </w:r>
+      <w:r>
+        <w:rPr>
+          <w:lang w:val="en-US"/>
+        </w:rPr>
+        <w:t>;</w:t>
+      </w:r>
+    </w:p>
+    <w:p>
+      <w:pPr>
+        <w:rPr>
+          <w:lang w:val="en-US"/>
+        </w:rPr>
+      </w:pPr>
+      <w:r>
+        <w:rPr>
+          <w:lang w:val="en-US"/>
+        </w:rPr>
+        <w:t>t</w:t>
+      </w:r>
+      <w:r>
+        <w:rPr>
+          <w:lang w:val="en-US"/>
+        </w:rPr>
+        <w:t>_</w:t>
+      </w:r>
+      <w:r>
+        <w:rPr>
+          <w:lang w:val="en-US"/>
+        </w:rPr>
+        <w:t>ion</w:t>
+      </w:r>
+      <w:r>
+        <w:rPr>
+          <w:lang w:val="en-US"/>
+        </w:rPr>
+        <w:t xml:space="preserve"> = 0.03</w:t>
+      </w:r>
+      <w:r>
+        <w:rPr>
+          <w:lang w:val="en-US"/>
+        </w:rPr>
+        <w:t>43</w:t>
+      </w:r>
+      <w:r>
+        <w:rPr>
+          <w:lang w:val="en-US"/>
+        </w:rPr>
+        <w:t>;</w:t>
+      </w:r>
+    </w:p>
+    <w:p>
+      <w:pPr>
+        <w:rPr>
+          <w:lang w:val="en-US"/>
+        </w:rPr>
+      </w:pPr>
+      <w:r>
+        <w:rPr>
+          <w:lang w:val="en-US"/>
+        </w:rPr>
+        <w:t>N</w:t>
+      </w:r>
+      <w:r>
+        <w:rPr>
+          <w:lang w:val="en-US"/>
+        </w:rPr>
+        <w:t>_</w:t>
+      </w:r>
+      <w:r>
+        <w:rPr>
+          <w:lang w:val="en-US"/>
+        </w:rPr>
+        <w:t>w</w:t>
+      </w:r>
+      <w:r>
+        <w:rPr>
+          <w:lang w:val="en-US"/>
+        </w:rPr>
+        <w:t>0 = 1.</w:t>
+      </w:r>
+      <w:r>
+        <w:rPr>
+          <w:lang w:val="en-US"/>
+        </w:rPr>
+        <w:t>946</w:t>
+      </w:r>
+      <w:r>
+        <w:rPr>
+          <w:lang w:val="en-US"/>
+        </w:rPr>
+        <w:t>e</w:t>
+      </w:r>
+      <w:r>
+        <w:rPr>
+          <w:lang w:val="en-US"/>
+        </w:rPr>
+        <w:t>2</w:t>
+      </w:r>
+      <w:r>
+        <w:rPr>
+          <w:lang w:val="en-US"/>
+        </w:rPr>
+        <w:t>2</w:t>
+      </w:r>
+      <w:r>
+        <w:rPr>
+          <w:lang w:val="en-US"/>
+        </w:rPr>
+        <w:t>;</w:t>
+      </w:r>
+    </w:p>
+    <w:p>
+      <w:pPr>
+        <w:rPr>
+          <w:lang w:val="en-US" w:eastAsia="ja-JP"/>
+        </w:rPr>
+      </w:pPr>
+    </w:p>
+    <w:p>
+      <w:pPr>
+        <w:rPr>
+          <w:lang w:val="en-US" w:eastAsia="ja-JP"/>
+        </w:rPr>
+      </w:pPr>
+    </w:p>
+    <w:p>
+      <w:pPr>
+        <w:rPr>
+          <w:lang w:val="en-US" w:eastAsia="ja-JP"/>
+        </w:rPr>
+        <w:sectPr>
+          <w:pgSz w:w="11906" w:h="16838"/>
+          <w:pgMar w:top="1134" w:right="850" w:bottom="1134" w:left="1701" w:header="708" w:footer="708" w:gutter="0"/>
+          <w:cols w:space="708"/>
+          <w:docGrid w:linePitch="381"/>
+        </w:sectPr>
+      </w:pPr>
+    </w:p>
+    <w:p>
+      <w:pPr>
+        <w:ind w:firstLine="0"/>
+        <w:jc w:val="center"/>
+      </w:pPr>
+      <w:r>
+        <w:rPr>
+          <w:noProof/>
+          <w:lang w:eastAsia="ja-JP"/>
+        </w:rPr>
+        <w:lastRenderedPageBreak/>
+        <w:drawing>
+          <wp:inline distT="0" distB="0" distL="0" distR="0" wp14:anchorId="01EE84C8" wp14:editId="21091AD9">
+            <wp:extent cx="9251950" cy="4570730"/>
+            <wp:effectExtent l="0" t="0" r="6350" b="1270"/>
+            <wp:docPr id="2" name="Рисунок 2"/>
+            <wp:cNvGraphicFramePr>
+              <a:graphicFrameLocks xmlns:a="http://schemas.openxmlformats.org/drawingml/2006/main" noChangeAspect="1"/>
+            </wp:cNvGraphicFramePr>
+            <a:graphic xmlns:a="http://schemas.openxmlformats.org/drawingml/2006/main">
+              <a:graphicData uri="http://schemas.openxmlformats.org/drawingml/2006/picture">
+                <pic:pic xmlns:pic="http://schemas.openxmlformats.org/drawingml/2006/picture">
+                  <pic:nvPicPr>
+                    <pic:cNvPr id="1" name=""/>
+                    <pic:cNvPicPr/>
+                  </pic:nvPicPr>
+                  <pic:blipFill>
+                    <a:blip r:embed="rId14"/>
+                    <a:stretch>
+                      <a:fillRect/>
+                    </a:stretch>
+                  </pic:blipFill>
+                  <pic:spPr>
+                    <a:xfrm>
+                      <a:off x="0" y="0"/>
+                      <a:ext cx="9251950" cy="4570730"/>
+                    </a:xfrm>
+                    <a:prstGeom prst="rect">
+                      <a:avLst/>
+                    </a:prstGeom>
+                  </pic:spPr>
+                </pic:pic>
+              </a:graphicData>
+            </a:graphic>
+          </wp:inline>
+        </w:drawing>
+      </w:r>
+    </w:p>
+    <w:p>
+      <w:pPr>
+        <w:ind w:firstLine="0"/>
+        <w:jc w:val="center"/>
+        <w:rPr>
+          <w:lang w:eastAsia="ja-JP"/>
+        </w:rPr>
+      </w:pPr>
+      <w:r>
+        <w:t xml:space="preserve">Рисунок </w:t>
+      </w:r>
+      <w:fldSimple w:instr=" SEQ Рисунок \* ARABIC ">
+        <w:r>
+          <w:rPr>
+            <w:noProof/>
+          </w:rPr>
+          <w:t>4</w:t>
+        </w:r>
+      </w:fldSimple>
+      <w:r>
+        <w:t xml:space="preserve"> - </w:t>
+      </w:r>
+      <w:r>
+        <w:t>Выход модели с новыми параметрами</w:t>
+      </w:r>
+      <w:r>
+        <w:t xml:space="preserve">. </w:t>
+      </w:r>
+      <w:r>
+        <w:t>Начало разряда 27.1 с, конец разряда 28 с, прекращение газонапуска</w:t>
+      </w:r>
+      <w:r>
+        <w:rPr>
+          <w:noProof/>
+        </w:rPr>
+        <w:t xml:space="preserve"> </w:t>
+      </w:r>
+      <w:r>
+        <w:rPr>
+          <w:noProof/>
+        </w:rPr>
+        <w:t>2000</w:t>
+      </w:r>
+      <w:r>
+        <w:rPr>
+          <w:noProof/>
+        </w:rPr>
+        <w:t xml:space="preserve"> с.</w:t>
+      </w:r>
+    </w:p>
+    <w:p>
+      <w:pPr>
+        <w:ind w:firstLine="0"/>
+        <w:jc w:val="center"/>
+      </w:pPr>
+      <w:r>
+        <w:rPr>
+          <w:noProof/>
+          <w:lang w:eastAsia="ja-JP"/>
+        </w:rPr>
+        <w:lastRenderedPageBreak/>
+        <w:drawing>
+          <wp:inline distT="0" distB="0" distL="0" distR="0" wp14:anchorId="714DDD03" wp14:editId="15A5CF6B">
+            <wp:extent cx="9251950" cy="4570730"/>
+            <wp:effectExtent l="0" t="0" r="6350" b="1270"/>
+            <wp:docPr id="4" name="Рисунок 4"/>
+            <wp:cNvGraphicFramePr>
+              <a:graphicFrameLocks xmlns:a="http://schemas.openxmlformats.org/drawingml/2006/main" noChangeAspect="1"/>
+            </wp:cNvGraphicFramePr>
+            <a:graphic xmlns:a="http://schemas.openxmlformats.org/drawingml/2006/main">
+              <a:graphicData uri="http://schemas.openxmlformats.org/drawingml/2006/picture">
+                <pic:pic xmlns:pic="http://schemas.openxmlformats.org/drawingml/2006/picture">
+                  <pic:nvPicPr>
+                    <pic:cNvPr id="1" name=""/>
+                    <pic:cNvPicPr/>
+                  </pic:nvPicPr>
+                  <pic:blipFill>
+                    <a:blip r:embed="rId15"/>
+                    <a:stretch>
+                      <a:fillRect/>
+                    </a:stretch>
+                  </pic:blipFill>
+                  <pic:spPr>
+                    <a:xfrm>
+                      <a:off x="0" y="0"/>
+                      <a:ext cx="9251950" cy="4570730"/>
+                    </a:xfrm>
+                    <a:prstGeom prst="rect">
+                      <a:avLst/>
+                    </a:prstGeom>
+                  </pic:spPr>
+                </pic:pic>
+              </a:graphicData>
+            </a:graphic>
+          </wp:inline>
+        </w:drawing>
+      </w:r>
+    </w:p>
+    <w:p>
+      <w:pPr>
+        <w:ind w:firstLine="0"/>
+        <w:jc w:val="center"/>
+      </w:pPr>
+      <w:r>
+        <w:t xml:space="preserve">Рисунок </w:t>
+      </w:r>
+      <w:fldSimple w:instr=" SEQ Рисунок \* ARABIC ">
+        <w:r>
+          <w:rPr>
+            <w:noProof/>
+          </w:rPr>
+          <w:t>5</w:t>
+        </w:r>
+      </w:fldSimple>
+      <w:r>
+        <w:t xml:space="preserve"> - </w:t>
+      </w:r>
+      <w:r>
+        <w:t>Выход модели с новыми параметрами</w:t>
+      </w:r>
+    </w:p>
+    <w:p>
+      <w:pPr>
+        <w:ind w:firstLine="0"/>
+        <w:jc w:val="center"/>
+      </w:pPr>
+    </w:p>
+    <w:p>
+      <w:pPr>
+        <w:ind w:firstLine="0"/>
+        <w:jc w:val="center"/>
+      </w:pPr>
+      <w:r>
+        <w:rPr>
+          <w:lang w:eastAsia="ja-JP"/>
+        </w:rPr>
+        <w:lastRenderedPageBreak/>
+        <w:drawing>
+          <wp:inline distT="0" distB="0" distL="0" distR="0" wp14:anchorId="27BCDFAD" wp14:editId="04BED612">
+            <wp:extent cx="9251950" cy="4573270"/>
+            <wp:effectExtent l="0" t="0" r="6350" b="0"/>
+            <wp:docPr id="3" name="Рисунок 3"/>
+            <wp:cNvGraphicFramePr>
+              <a:graphicFrameLocks xmlns:a="http://schemas.openxmlformats.org/drawingml/2006/main" noChangeAspect="1"/>
+            </wp:cNvGraphicFramePr>
+            <a:graphic xmlns:a="http://schemas.openxmlformats.org/drawingml/2006/main">
+              <a:graphicData uri="http://schemas.openxmlformats.org/drawingml/2006/picture">
+                <pic:pic xmlns:pic="http://schemas.openxmlformats.org/drawingml/2006/picture">
+                  <pic:nvPicPr>
+                    <pic:cNvPr id="1" name=""/>
+                    <pic:cNvPicPr/>
+                  </pic:nvPicPr>
+                  <pic:blipFill>
+                    <a:blip r:embed="rId16"/>
+                    <a:stretch>
+                      <a:fillRect/>
+                    </a:stretch>
+                  </pic:blipFill>
+                  <pic:spPr>
+                    <a:xfrm>
+                      <a:off x="0" y="0"/>
+                      <a:ext cx="9251950" cy="4573270"/>
+                    </a:xfrm>
+                    <a:prstGeom prst="rect">
+                      <a:avLst/>
+                    </a:prstGeom>
+                  </pic:spPr>
+                </pic:pic>
+              </a:graphicData>
+            </a:graphic>
+          </wp:inline>
+        </w:drawing>
+      </w:r>
+    </w:p>
+    <w:p>
+      <w:pPr>
+        <w:ind w:firstLine="0"/>
+        <w:jc w:val="center"/>
+        <w:rPr>
+          <w:noProof/>
+        </w:rPr>
+      </w:pPr>
+      <w:r>
+        <w:t xml:space="preserve">Рисунок </w:t>
+      </w:r>
+      <w:fldSimple w:instr=" SEQ Рисунок \* ARABIC ">
+        <w:r>
+          <w:rPr>
+            <w:noProof/>
+          </w:rPr>
+          <w:t>6</w:t>
+        </w:r>
+      </w:fldSimple>
+      <w:r>
+        <w:t xml:space="preserve"> - Моделирование трех разрядов в модели с новыми параметрами. Первый разряд в 427,1 с, второй разряд</w:t>
+      </w:r>
+      <w:r>
+        <w:rPr>
+          <w:noProof/>
+        </w:rPr>
+        <w:t xml:space="preserve"> 1</w:t>
+      </w:r>
+      <w:r>
+        <w:rPr>
+          <w:noProof/>
+        </w:rPr>
+        <w:t>427,1 с</w:t>
+      </w:r>
+      <w:r>
+        <w:rPr>
+          <w:noProof/>
+        </w:rPr>
+        <w:t>, третий разряд в 5</w:t>
+      </w:r>
+      <w:r>
+        <w:rPr>
+          <w:noProof/>
+        </w:rPr>
+        <w:t>427,1 с</w:t>
+      </w:r>
+      <w:r>
+        <w:rPr>
+          <w:noProof/>
+        </w:rPr>
+        <w:t>. Прекращение газонапуска в 500 с.</w:t>
+      </w:r>
+    </w:p>
+    <w:p>
+      <w:pPr>
+        <w:ind w:firstLine="0"/>
+        <w:jc w:val="center"/>
+      </w:pPr>
+      <w:r>
+        <w:rPr>
+          <w:lang w:eastAsia="ja-JP"/>
+        </w:rPr>
+        <w:lastRenderedPageBreak/>
+        <w:drawing>
+          <wp:inline distT="0" distB="0" distL="0" distR="0" wp14:anchorId="09350689" wp14:editId="2E19010A">
+            <wp:extent cx="9251950" cy="4573270"/>
+            <wp:effectExtent l="0" t="0" r="6350" b="0"/>
+            <wp:docPr id="5" name="Рисунок 5"/>
+            <wp:cNvGraphicFramePr>
+              <a:graphicFrameLocks xmlns:a="http://schemas.openxmlformats.org/drawingml/2006/main" noChangeAspect="1"/>
+            </wp:cNvGraphicFramePr>
+            <a:graphic xmlns:a="http://schemas.openxmlformats.org/drawingml/2006/main">
+              <a:graphicData uri="http://schemas.openxmlformats.org/drawingml/2006/picture">
+                <pic:pic xmlns:pic="http://schemas.openxmlformats.org/drawingml/2006/picture">
+                  <pic:nvPicPr>
+                    <pic:cNvPr id="1" name=""/>
+                    <pic:cNvPicPr/>
+                  </pic:nvPicPr>
+                  <pic:blipFill>
+                    <a:blip r:embed="rId17"/>
+                    <a:stretch>
+                      <a:fillRect/>
+                    </a:stretch>
+                  </pic:blipFill>
+                  <pic:spPr>
+                    <a:xfrm>
+                      <a:off x="0" y="0"/>
+                      <a:ext cx="9251950" cy="4573270"/>
+                    </a:xfrm>
+                    <a:prstGeom prst="rect">
+                      <a:avLst/>
+                    </a:prstGeom>
+                  </pic:spPr>
+                </pic:pic>
+              </a:graphicData>
+            </a:graphic>
+          </wp:inline>
+        </w:drawing>
+      </w:r>
+    </w:p>
+    <w:p>
+      <w:pPr>
+        <w:ind w:firstLine="0"/>
+        <w:jc w:val="center"/>
+      </w:pPr>
+      <w:r>
+        <w:t xml:space="preserve">Рисунок </w:t>
+      </w:r>
+      <w:fldSimple w:instr=" SEQ Рисунок \* ARABIC ">
+        <w:r>
+          <w:rPr>
+            <w:noProof/>
+          </w:rPr>
+          <w:t>7</w:t>
+        </w:r>
+      </w:fldSimple>
+      <w:r>
+        <w:t xml:space="preserve"> - Первый разряд</w:t>
+      </w:r>
+    </w:p>
+    <w:p>
+      <w:pPr>
+        <w:ind w:firstLine="0"/>
+        <w:jc w:val="center"/>
+      </w:pPr>
+      <w:r>
+        <w:rPr>
+          <w:lang w:eastAsia="ja-JP"/>
+        </w:rPr>
+        <w:lastRenderedPageBreak/>
+        <w:drawing>
+          <wp:inline distT="0" distB="0" distL="0" distR="0" wp14:anchorId="3DD0C910" wp14:editId="284B6324">
+            <wp:extent cx="9251950" cy="4573270"/>
+            <wp:effectExtent l="0" t="0" r="6350" b="0"/>
+            <wp:docPr id="6" name="Рисунок 6"/>
+            <wp:cNvGraphicFramePr>
+              <a:graphicFrameLocks xmlns:a="http://schemas.openxmlformats.org/drawingml/2006/main" noChangeAspect="1"/>
+            </wp:cNvGraphicFramePr>
+            <a:graphic xmlns:a="http://schemas.openxmlformats.org/drawingml/2006/main">
+              <a:graphicData uri="http://schemas.openxmlformats.org/drawingml/2006/picture">
+                <pic:pic xmlns:pic="http://schemas.openxmlformats.org/drawingml/2006/picture">
+                  <pic:nvPicPr>
+                    <pic:cNvPr id="1" name=""/>
+                    <pic:cNvPicPr/>
+                  </pic:nvPicPr>
+                  <pic:blipFill>
+                    <a:blip r:embed="rId18"/>
+                    <a:stretch>
+                      <a:fillRect/>
+                    </a:stretch>
+                  </pic:blipFill>
+                  <pic:spPr>
+                    <a:xfrm>
+                      <a:off x="0" y="0"/>
+                      <a:ext cx="9251950" cy="4573270"/>
+                    </a:xfrm>
+                    <a:prstGeom prst="rect">
+                      <a:avLst/>
+                    </a:prstGeom>
+                  </pic:spPr>
+                </pic:pic>
+              </a:graphicData>
+            </a:graphic>
+          </wp:inline>
+        </w:drawing>
+      </w:r>
+    </w:p>
+    <w:p>
+      <w:pPr>
+        <w:ind w:firstLine="0"/>
+        <w:jc w:val="center"/>
+      </w:pPr>
+      <w:r>
+        <w:t xml:space="preserve">Рисунок </w:t>
+      </w:r>
+      <w:fldSimple w:instr=" SEQ Рисунок \* ARABIC ">
+        <w:r>
+          <w:rPr>
+            <w:noProof/>
+          </w:rPr>
+          <w:t>8</w:t>
+        </w:r>
+      </w:fldSimple>
+      <w:r>
+        <w:t xml:space="preserve"> - Второй разряд</w:t>
+      </w:r>
+    </w:p>
+    <w:p>
+      <w:pPr>
+        <w:ind w:firstLine="0"/>
+        <w:jc w:val="center"/>
+      </w:pPr>
+      <w:r>
+        <w:rPr>
+          <w:lang w:eastAsia="ja-JP"/>
+        </w:rPr>
+        <w:lastRenderedPageBreak/>
+        <w:drawing>
+          <wp:inline distT="0" distB="0" distL="0" distR="0" wp14:anchorId="10D1F0FE" wp14:editId="2A199ED5">
+            <wp:extent cx="9251950" cy="4573270"/>
+            <wp:effectExtent l="0" t="0" r="6350" b="0"/>
+            <wp:docPr id="10" name="Рисунок 10"/>
+            <wp:cNvGraphicFramePr>
+              <a:graphicFrameLocks xmlns:a="http://schemas.openxmlformats.org/drawingml/2006/main" noChangeAspect="1"/>
+            </wp:cNvGraphicFramePr>
+            <a:graphic xmlns:a="http://schemas.openxmlformats.org/drawingml/2006/main">
+              <a:graphicData uri="http://schemas.openxmlformats.org/drawingml/2006/picture">
+                <pic:pic xmlns:pic="http://schemas.openxmlformats.org/drawingml/2006/picture">
+                  <pic:nvPicPr>
+                    <pic:cNvPr id="1" name=""/>
+                    <pic:cNvPicPr/>
+                  </pic:nvPicPr>
+                  <pic:blipFill>
+                    <a:blip r:embed="rId19"/>
+                    <a:stretch>
+                      <a:fillRect/>
+                    </a:stretch>
+                  </pic:blipFill>
+                  <pic:spPr>
+                    <a:xfrm>
+                      <a:off x="0" y="0"/>
+                      <a:ext cx="9251950" cy="4573270"/>
+                    </a:xfrm>
+                    <a:prstGeom prst="rect">
+                      <a:avLst/>
+                    </a:prstGeom>
+                  </pic:spPr>
+                </pic:pic>
+              </a:graphicData>
+            </a:graphic>
+          </wp:inline>
+        </w:drawing>
+      </w:r>
+    </w:p>
+    <w:p>
+      <w:pPr>
+        <w:ind w:firstLine="0"/>
+        <w:jc w:val="center"/>
+      </w:pPr>
+      <w:r>
+        <w:t xml:space="preserve">Рисунок </w:t>
+      </w:r>
+      <w:fldSimple w:instr=" SEQ Рисунок \* ARABIC ">
+        <w:r>
+          <w:rPr>
+            <w:noProof/>
+          </w:rPr>
+          <w:t>9</w:t>
+        </w:r>
+      </w:fldSimple>
+      <w:r>
+        <w:t xml:space="preserve"> - Третий разряд</w:t>
+      </w:r>
+    </w:p>
+    <w:p>
+      <w:pPr>
+        <w:ind w:firstLine="0"/>
+        <w:jc w:val="center"/>
+        <w:rPr>
+          <w:lang w:eastAsia="ja-JP"/>
+        </w:rPr>
+      </w:pPr>
     </w:p>
     <w:sectPr>
       <w:pgSz w:w="16838" w:h="11906" w:orient="landscape"/>
@@ -1596,7 +2326,7 @@
     <w:name w:val="Normal"/>
     <w:aliases w:val="Для работы"/>
     <w:qFormat/>
-    <w:rsid w:val="00920398"/>
+    <w:rsid w:val="00A050A4"/>
     <w:pPr>
       <w:spacing w:after="0" w:line="360" w:lineRule="auto"/>
       <w:ind w:firstLine="851"/>

</xml_diff>